<commit_message>
Add birthday and college fields
</commit_message>
<xml_diff>
--- a/public/assets/member-profile-word-template-v2.docx
+++ b/public/assets/member-profile-word-template-v2.docx
@@ -717,7 +717,7 @@
           </w:tblCellMar>
         </w:tblPrEx>
         <w:trPr>
-          <w:trHeight w:val="391" w:hRule="atLeast"/>
+          <w:trHeight w:val="384" w:hRule="atLeast"/>
         </w:trPr>
         <w:tc>
           <w:tcPr>
@@ -841,6 +841,125 @@
             <w:pPr>
               <w:pStyle w:val="5"/>
             </w:pPr>
+          </w:p>
+        </w:tc>
+      </w:tr>
+      <w:tr>
+        <w:tblPrEx>
+          <w:tblBorders>
+            <w:top w:val="single" w:color="000000" w:sz="2" w:space="0"/>
+            <w:left w:val="single" w:color="000000" w:sz="2" w:space="0"/>
+            <w:bottom w:val="single" w:color="000000" w:sz="2" w:space="0"/>
+            <w:right w:val="single" w:color="000000" w:sz="2" w:space="0"/>
+            <w:insideH w:val="single" w:color="000000" w:sz="2" w:space="0"/>
+            <w:insideV w:val="single" w:color="000000" w:sz="2" w:space="0"/>
+          </w:tblBorders>
+          <w:tblCellMar>
+            <w:top w:w="0" w:type="dxa"/>
+            <w:left w:w="0" w:type="dxa"/>
+            <w:bottom w:w="0" w:type="dxa"/>
+            <w:right w:w="0" w:type="dxa"/>
+          </w:tblCellMar>
+        </w:tblPrEx>
+        <w:trPr>
+          <w:trHeight w:val="391" w:hRule="atLeast"/>
+        </w:trPr>
+        <w:tc>
+          <w:tcPr>
+            <w:tcW w:w="1275" w:type="dxa"/>
+            <w:gridSpan w:val="2"/>
+            <w:vAlign w:val="top"/>
+          </w:tcPr>
+          <w:p>
+            <w:pPr>
+              <w:spacing w:before="80" w:line="186" w:lineRule="auto"/>
+              <w:ind w:left="118"/>
+              <w:jc w:val="both"/>
+              <w:rPr>
+                <w:rFonts w:hint="eastAsia" w:ascii="等线" w:hAnsi="等线" w:eastAsia="等线" w:cs="等线"/>
+                <w:spacing w:val="-6"/>
+                <w:sz w:val="21"/>
+                <w:szCs w:val="21"/>
+                <w:lang w:val="en-US" w:eastAsia="zh-CN"/>
+              </w:rPr>
+            </w:pPr>
+            <w:r>
+              <w:rPr>
+                <w:rFonts w:hint="eastAsia" w:ascii="等线" w:hAnsi="等线" w:eastAsia="等线" w:cs="等线"/>
+                <w:spacing w:val="-6"/>
+                <w:sz w:val="21"/>
+                <w:szCs w:val="21"/>
+                <w:lang w:val="en-US" w:eastAsia="zh-CN"/>
+              </w:rPr>
+              <w:t>生             日</w:t>
+            </w:r>
+          </w:p>
+        </w:tc>
+        <w:tc>
+          <w:tcPr>
+            <w:tcW w:w="1699" w:type="dxa"/>
+            <w:gridSpan w:val="3"/>
+            <w:vAlign w:val="center"/>
+          </w:tcPr>
+          <w:p>
+            <w:pPr>
+              <w:jc w:val="center"/>
+            </w:pPr>
+            <w:r>
+              <w:rPr>
+                <w:rFonts w:ascii="宋体" w:hAnsi="宋体"/>
+                <w:sz w:val="16"/>
+              </w:rPr>
+              <w:t>{{birthday}}</w:t>
+            </w:r>
+          </w:p>
+        </w:tc>
+        <w:tc>
+          <w:tcPr>
+            <w:tcW w:w="1417" w:type="dxa"/>
+            <w:vAlign w:val="top"/>
+          </w:tcPr>
+          <w:p>
+            <w:pPr>
+              <w:spacing w:before="52" w:line="228" w:lineRule="auto"/>
+              <w:ind w:left="116"/>
+              <w:rPr>
+                <w:rFonts w:hint="default" w:ascii="等线" w:hAnsi="等线" w:eastAsia="等线" w:cs="等线"/>
+                <w:spacing w:val="-4"/>
+                <w:sz w:val="21"/>
+                <w:szCs w:val="21"/>
+                <w:lang w:val="en-US" w:eastAsia="zh-CN"/>
+              </w:rPr>
+            </w:pPr>
+            <w:r>
+              <w:rPr>
+                <w:rFonts w:hint="eastAsia" w:ascii="等线" w:hAnsi="等线" w:eastAsia="等线" w:cs="等线"/>
+                <w:spacing w:val="-4"/>
+                <w:sz w:val="21"/>
+                <w:szCs w:val="21"/>
+                <w:lang w:val="en-US" w:eastAsia="zh-CN"/>
+              </w:rPr>
+              <w:t>所在学院(部)</w:t>
+            </w:r>
+          </w:p>
+        </w:tc>
+        <w:tc>
+          <w:tcPr>
+            <w:tcW w:w="3911" w:type="dxa"/>
+            <w:gridSpan w:val="3"/>
+            <w:vAlign w:val="center"/>
+          </w:tcPr>
+          <w:p>
+            <w:pPr>
+              <w:jc w:val="center"/>
+            </w:pPr>
+            <w:r>
+              <w:rPr>
+                <w:rFonts w:ascii="宋体" w:hAnsi="宋体"/>
+                <w:sz w:val="16"/>
+              </w:rPr>
+              <w:t>{{college}}</w:t>
+            </w:r>
           </w:p>
         </w:tc>
       </w:tr>
@@ -1349,6 +1468,14 @@
       </w:tr>
       <w:tr>
         <w:tblPrEx>
+          <w:tblBorders>
+            <w:top w:val="single" w:color="000000" w:sz="2" w:space="0"/>
+            <w:left w:val="single" w:color="000000" w:sz="2" w:space="0"/>
+            <w:bottom w:val="single" w:color="000000" w:sz="2" w:space="0"/>
+            <w:right w:val="single" w:color="000000" w:sz="2" w:space="0"/>
+            <w:insideH w:val="single" w:color="000000" w:sz="2" w:space="0"/>
+            <w:insideV w:val="single" w:color="000000" w:sz="2" w:space="0"/>
+          </w:tblBorders>
           <w:tblCellMar>
             <w:top w:w="0" w:type="dxa"/>
             <w:left w:w="0" w:type="dxa"/>
@@ -1383,99 +1510,6 @@
                 <w:szCs w:val="21"/>
               </w:rPr>
               <w:t>团员排练考勤表</w:t>
-            </w:r>
-          </w:p>
-        </w:tc>
-      </w:tr>
-      <w:tr>
-        <w:tblPrEx>
-          <w:tblCellMar>
-            <w:top w:w="0" w:type="dxa"/>
-            <w:left w:w="0" w:type="dxa"/>
-            <w:bottom w:w="0" w:type="dxa"/>
-            <w:right w:w="0" w:type="dxa"/>
-          </w:tblCellMar>
-        </w:tblPrEx>
-        <w:trPr>
-          <w:trHeight w:val="316" w:hRule="atLeast"/>
-        </w:trPr>
-        <w:tc>
-          <w:tcPr>
-            <w:tcW w:w="1983" w:type="dxa"/>
-            <w:gridSpan w:val="4"/>
-            <w:vAlign w:val="top"/>
-          </w:tcPr>
-          <w:p>
-            <w:pPr>
-              <w:spacing w:before="48" w:line="217" w:lineRule="auto"/>
-              <w:ind w:left="793"/>
-              <w:rPr>
-                <w:rFonts w:ascii="等线" w:hAnsi="等线" w:eastAsia="等线" w:cs="等线"/>
-                <w:sz w:val="21"/>
-                <w:szCs w:val="21"/>
-              </w:rPr>
-            </w:pPr>
-            <w:r>
-              <w:rPr>
-                <w:rFonts w:ascii="等线" w:hAnsi="等线" w:eastAsia="等线" w:cs="等线"/>
-                <w:spacing w:val="-3"/>
-                <w:sz w:val="21"/>
-                <w:szCs w:val="21"/>
-              </w:rPr>
-              <w:t>学期</w:t>
-            </w:r>
-          </w:p>
-        </w:tc>
-        <w:tc>
-          <w:tcPr>
-            <w:tcW w:w="4817" w:type="dxa"/>
-            <w:gridSpan w:val="4"/>
-            <w:vAlign w:val="top"/>
-          </w:tcPr>
-          <w:p>
-            <w:pPr>
-              <w:spacing w:before="48" w:line="217" w:lineRule="auto"/>
-              <w:ind w:left="664"/>
-              <w:rPr>
-                <w:rFonts w:ascii="等线" w:hAnsi="等线" w:eastAsia="等线" w:cs="等线"/>
-                <w:sz w:val="21"/>
-                <w:szCs w:val="21"/>
-              </w:rPr>
-            </w:pPr>
-            <w:r>
-              <w:rPr>
-                <w:rFonts w:ascii="等线" w:hAnsi="等线" w:eastAsia="等线" w:cs="等线"/>
-                <w:spacing w:val="-2"/>
-                <w:sz w:val="21"/>
-                <w:szCs w:val="21"/>
-              </w:rPr>
-              <w:t>考勤标记（90%优、80%良、60%及格）</w:t>
-            </w:r>
-          </w:p>
-        </w:tc>
-        <w:tc>
-          <w:tcPr>
-            <w:tcW w:w="1502" w:type="dxa"/>
-            <w:vAlign w:val="top"/>
-          </w:tcPr>
-          <w:p>
-            <w:pPr>
-              <w:spacing w:before="48" w:line="217" w:lineRule="auto"/>
-              <w:ind w:left="237"/>
-              <w:rPr>
-                <w:rFonts w:ascii="等线" w:hAnsi="等线" w:eastAsia="等线" w:cs="等线"/>
-                <w:sz w:val="21"/>
-                <w:szCs w:val="21"/>
-              </w:rPr>
-            </w:pPr>
-            <w:r>
-              <w:rPr>
-                <w:rFonts w:ascii="等线" w:hAnsi="等线" w:eastAsia="等线" w:cs="等线"/>
-                <w:spacing w:val="-3"/>
-                <w:sz w:val="21"/>
-                <w:szCs w:val="21"/>
-              </w:rPr>
-              <w:t>声部长签字</w:t>
             </w:r>
           </w:p>
         </w:tc>
@@ -1508,6 +1542,107 @@
           </w:tcPr>
           <w:p>
             <w:pPr>
+              <w:spacing w:before="48" w:line="217" w:lineRule="auto"/>
+              <w:ind w:left="793"/>
+              <w:rPr>
+                <w:rFonts w:ascii="等线" w:hAnsi="等线" w:eastAsia="等线" w:cs="等线"/>
+                <w:sz w:val="21"/>
+                <w:szCs w:val="21"/>
+              </w:rPr>
+            </w:pPr>
+            <w:r>
+              <w:rPr>
+                <w:rFonts w:ascii="等线" w:hAnsi="等线" w:eastAsia="等线" w:cs="等线"/>
+                <w:spacing w:val="-3"/>
+                <w:sz w:val="21"/>
+                <w:szCs w:val="21"/>
+              </w:rPr>
+              <w:t>学期</w:t>
+            </w:r>
+          </w:p>
+        </w:tc>
+        <w:tc>
+          <w:tcPr>
+            <w:tcW w:w="4817" w:type="dxa"/>
+            <w:gridSpan w:val="4"/>
+            <w:vAlign w:val="top"/>
+          </w:tcPr>
+          <w:p>
+            <w:pPr>
+              <w:spacing w:before="48" w:line="217" w:lineRule="auto"/>
+              <w:ind w:left="664"/>
+              <w:rPr>
+                <w:rFonts w:ascii="等线" w:hAnsi="等线" w:eastAsia="等线" w:cs="等线"/>
+                <w:sz w:val="21"/>
+                <w:szCs w:val="21"/>
+              </w:rPr>
+            </w:pPr>
+            <w:r>
+              <w:rPr>
+                <w:rFonts w:ascii="等线" w:hAnsi="等线" w:eastAsia="等线" w:cs="等线"/>
+                <w:spacing w:val="-2"/>
+                <w:sz w:val="21"/>
+                <w:szCs w:val="21"/>
+              </w:rPr>
+              <w:t>考勤标记（90%优、80%良、60%及格）</w:t>
+            </w:r>
+          </w:p>
+        </w:tc>
+        <w:tc>
+          <w:tcPr>
+            <w:tcW w:w="1502" w:type="dxa"/>
+            <w:vAlign w:val="top"/>
+          </w:tcPr>
+          <w:p>
+            <w:pPr>
+              <w:spacing w:before="48" w:line="217" w:lineRule="auto"/>
+              <w:ind w:left="237"/>
+              <w:rPr>
+                <w:rFonts w:ascii="等线" w:hAnsi="等线" w:eastAsia="等线" w:cs="等线"/>
+                <w:sz w:val="21"/>
+                <w:szCs w:val="21"/>
+              </w:rPr>
+            </w:pPr>
+            <w:r>
+              <w:rPr>
+                <w:rFonts w:ascii="等线" w:hAnsi="等线" w:eastAsia="等线" w:cs="等线"/>
+                <w:spacing w:val="-3"/>
+                <w:sz w:val="21"/>
+                <w:szCs w:val="21"/>
+              </w:rPr>
+              <w:t>声部长签字</w:t>
+            </w:r>
+          </w:p>
+        </w:tc>
+      </w:tr>
+      <w:tr>
+        <w:tblPrEx>
+          <w:tblBorders>
+            <w:top w:val="single" w:color="000000" w:sz="2" w:space="0"/>
+            <w:left w:val="single" w:color="000000" w:sz="2" w:space="0"/>
+            <w:bottom w:val="single" w:color="000000" w:sz="2" w:space="0"/>
+            <w:right w:val="single" w:color="000000" w:sz="2" w:space="0"/>
+            <w:insideH w:val="single" w:color="000000" w:sz="2" w:space="0"/>
+            <w:insideV w:val="single" w:color="000000" w:sz="2" w:space="0"/>
+          </w:tblBorders>
+          <w:tblCellMar>
+            <w:top w:w="0" w:type="dxa"/>
+            <w:left w:w="0" w:type="dxa"/>
+            <w:bottom w:w="0" w:type="dxa"/>
+            <w:right w:w="0" w:type="dxa"/>
+          </w:tblCellMar>
+        </w:tblPrEx>
+        <w:trPr>
+          <w:trHeight w:val="316" w:hRule="atLeast"/>
+        </w:trPr>
+        <w:tc>
+          <w:tcPr>
+            <w:tcW w:w="1983" w:type="dxa"/>
+            <w:gridSpan w:val="4"/>
+            <w:vAlign w:val="top"/>
+          </w:tcPr>
+          <w:p>
+            <w:pPr>
               <w:pStyle w:val="5"/>
             </w:pPr>
           </w:p>
@@ -1578,8 +1713,6 @@
             <w:pPr>
               <w:pStyle w:val="5"/>
             </w:pPr>
-            <w:bookmarkStart w:id="0" w:name="_GoBack"/>
-            <w:bookmarkEnd w:id="0"/>
           </w:p>
         </w:tc>
         <w:tc>
@@ -2878,7 +3011,8 @@
     </w:pPr>
     <w:r>
       <w:pict>
-        <v:shape id="_x0000_s2049" o:spid="_x0000_s2049" style="position:absolute;left:0pt;margin-left:88.55pt;margin-top:55.65pt;height:0.75pt;width:418.3pt;mso-position-horizontal-relative:page;mso-position-vertical-relative:page;z-index:251660288;mso-width-relative:page;mso-height-relative:page;" fillcolor="#000000" filled="t" stroked="f" coordsize="8365,15" o:allowincell="f" path="m0,14l8365,14,8365,0,0,0,0,14xe">
+        <v:shape id="_x0000_s4097" o:spid="_x0000_s4097" style="position:absolute;left:0pt;margin-left:88.55pt;margin-top:55.65pt;height:0.75pt;width:418.3pt;mso-position-horizontal-relative:page;mso-position-vertical-relative:page;z-index:251660288;mso-width-relative:page;mso-height-relative:page;" fillcolor="#000000" filled="t" stroked="f" coordsize="8365,15" o:allowincell="f" path="m0,14l8365,14,8365,0,0,0,0,14xe">
+          <v:path/>
           <v:fill on="t" focussize="0,0"/>
           <v:stroke on="f"/>
           <v:imagedata o:title=""/>
@@ -2888,7 +3022,7 @@
     </w:r>
     <w:r>
       <w:pict>
-        <v:shape id="WordPictureWatermark4" o:spid="_x0000_s2050" o:spt="75" type="#_x0000_t75" style="position:absolute;left:0pt;margin-left:90.25pt;margin-top:213.6pt;height:414.75pt;width:414.75pt;mso-position-horizontal-relative:page;mso-position-vertical-relative:page;z-index:-251657216;mso-width-relative:page;mso-height-relative:page;" filled="f" stroked="f" coordsize="21600,21600" o:allowincell="f">
+        <v:shape id="WordPictureWatermark4" o:spid="_x0000_s4098" o:spt="75" type="#_x0000_t75" style="position:absolute;left:0pt;margin-left:90.25pt;margin-top:213.6pt;height:414.75pt;width:414.75pt;mso-position-horizontal-relative:page;mso-position-vertical-relative:page;z-index:-251657216;mso-width-relative:page;mso-height-relative:page;" filled="f" stroked="f" coordsize="21600,21600" o:allowincell="f">
           <v:path/>
           <v:fill on="f" focussize="0,0"/>
           <v:stroke on="f"/>
@@ -3015,7 +3149,7 @@
     <w:lsdException w:unhideWhenUsed="0" w:uiPriority="0" w:semiHidden="0" w:name="HTML Sample"/>
     <w:lsdException w:unhideWhenUsed="0" w:uiPriority="0" w:semiHidden="0" w:name="HTML Typewriter"/>
     <w:lsdException w:unhideWhenUsed="0" w:uiPriority="0" w:semiHidden="0" w:name="HTML Variable"/>
-    <w:lsdException w:unhideWhenUsed="0" w:uiPriority="0" w:name="Normal Table"/>
+    <w:lsdException w:qFormat="1" w:unhideWhenUsed="0" w:uiPriority="0" w:name="Normal Table"/>
     <w:lsdException w:unhideWhenUsed="0" w:uiPriority="0" w:semiHidden="0" w:name="annotation subject"/>
     <w:lsdException w:unhideWhenUsed="0" w:uiPriority="0" w:semiHidden="0" w:name="Table Simple 1"/>
     <w:lsdException w:unhideWhenUsed="0" w:uiPriority="0" w:semiHidden="0" w:name="Table Simple 2"/>
@@ -3195,6 +3329,7 @@
   <w:style w:type="table" w:default="1" w:styleId="2">
     <w:name w:val="Normal Table"/>
     <w:semiHidden/>
+    <w:qFormat/>
     <w:uiPriority w:val="0"/>
     <w:tblPr>
       <w:tblCellMar>
@@ -3524,8 +3659,8 @@
 <s:customData xmlns="http://www.wps.cn/officeDocument/2013/wpsCustomData" xmlns:s="http://www.wps.cn/officeDocument/2013/wpsCustomData">
   <customSectProps/>
   <customShpExts>
-    <customShpInfo spid="_x0000_s2049"/>
-    <customShpInfo spid="_x0000_s2050"/>
+    <customShpInfo spid="_x0000_s4097"/>
+    <customShpInfo spid="_x0000_s4098"/>
   </customShpExts>
 </s:customData>
 </file>

</xml_diff>